<commit_message>
docs(calidad): PAT-04 pasa a C (07/10): interfaz 31/32 · 96,9 % en la evaluación de la IA
Se dividieron los archivos que mezclaban responsabilidades (Ajustes de la clase, las ventanas de
crear contenido y el constructor HTML/CSS); los 20 archivos grandes que quedan tienen su motivo y una
prueba que no los deja crecer. Solo queda en CP UX-08 (el SUS del equipo). Arquitectura del
frontend §5 con las cifras del 07/10.

Co-Authored-By: Claude Opus 5.5 <noreply@anthropic.com>
Claude-Session: https://claude.ai/code/session_01CRFvymDoVZwBiCPLA5rBRs
</commit_message>
<xml_diff>
--- a/docs/calidad/listas-chequeo/2026-10-06_v2.0.0/CHECKLIST_INTERFAZ_2026-10-06.docx
+++ b/docs/calidad/listas-chequeo/2026-10-06_v2.0.0/CHECKLIST_INTERFAZ_2026-10-06.docx
@@ -387,7 +387,7 @@
                 <w:color w:val="0F172A"/>
                 <w:sz w:val="18"/>
               </w:rPr>
-              <w:t>93.8 / 100 pts  (93.8 %) — 30 de 32 puntos · Sobresaliente</w:t>
+              <w:t>96.9 / 100 pts  (96.9 %) — 31 de 32 puntos · Sobresaliente (actualizada el 07/10)</w:t>
             </w:r>
           </w:p>
         </w:tc>
@@ -5320,7 +5320,7 @@
                 <w:color w:val="1E3A8A"/>
                 <w:sz w:val="16"/>
               </w:rPr>
-              <w:t>☐ C</w:t>
+              <w:t>☒ C</w:t>
             </w:r>
           </w:p>
           <w:p>
@@ -5334,7 +5334,7 @@
                 <w:color w:val="0F172A"/>
                 <w:sz w:val="16"/>
               </w:rPr>
-              <w:t>☒ CP</w:t>
+              <w:t>☐ CP</w:t>
             </w:r>
           </w:p>
           <w:p>
@@ -5386,13 +5386,11 @@
                 <w:color w:val="64748B"/>
                 <w:sz w:val="15"/>
               </w:rPr>
-              <w:t>Pts: 1 / 2</w:t>
+              <w:t>Pts: 2 / 2</w:t>
               <w:br/>
               <w:t>Obs: [x] Inspección de código contra The Blob</w:t>
               <w:br/>
-              <w:t>Evidencia: Sin «Mystery Meat» (0 botones sin nombre) ni ventanas encimadas. «The Blob» se atacó por responsabilidad, no por longitud: el panel del admin pasó de 1532 a 93 líneas, Contenidos de 1131 a 338, el editor de diagramas de 1322 a 791 y Notas de 584 a 102. 23 de 153 archivos pasan de 300 líneas y cada uno tiene escrito por qué (prueba pat04-componentes-grandes, que no deja crecer ninguno). Sigue en CP porque Ajustes de la clase (604 líneas) todavía junta seis secciones independientes.</w:t>
-              <w:br/>
-              <w:t>Ajuste: Dividir Ajustes de la clase por secciones y CurriculumBuilderModals (varias ventanas en un archivo).</w:t>
+              <w:t>Evidencia: Sin «Mystery Meat» (0 botones sin nombre) ni ventanas encimadas: todas las ventanas usan la misma base accesible. «The Blob» se atacó por responsabilidad, no por longitud: se dividieron los cinco archivos que mezclaban responsabilidades (panel del admin 1532 → 93 líneas, Contenidos 1131 → 338, Ajustes de la clase 604 → 153, las tres ventanas de crear contenido 429 → una sola ventana, el constructor de ejercicios HTML/CSS 645 → 174 con su lógica en una utilidad con prueba). Quedan 20 de 159 archivos de más de 300 líneas, cada uno con su motivo escrito (una sola herramienta: editor de diagramas, editor de código, cajón del Tutor…); la prueba pat04-componentes-grandes no deja que crezcan ni que aparezcan nuevos (actualizado el 07/10).</w:t>
             </w:r>
           </w:p>
         </w:tc>
@@ -5804,7 +5802,7 @@
               <w:rPr>
                 <w:sz w:val="17"/>
               </w:rPr>
-              <w:t>7 pts</w:t>
+              <w:t>8 pts</w:t>
             </w:r>
           </w:p>
         </w:tc>
@@ -5828,7 +5826,7 @@
               <w:rPr>
                 <w:sz w:val="17"/>
               </w:rPr>
-              <w:t>87.5 %</w:t>
+              <w:t>100.0 %</w:t>
             </w:r>
           </w:p>
         </w:tc>
@@ -5897,7 +5895,7 @@
                 <w:b/>
                 <w:sz w:val="18"/>
               </w:rPr>
-              <w:t>30 pts</w:t>
+              <w:t>31 pts</w:t>
             </w:r>
           </w:p>
         </w:tc>
@@ -5922,7 +5920,7 @@
                 <w:b/>
                 <w:sz w:val="18"/>
               </w:rPr>
-              <w:t>93.8 %</w:t>
+              <w:t>96.9 %</w:t>
             </w:r>
           </w:p>
         </w:tc>
@@ -6023,7 +6021,7 @@
                 <w:color w:val="0F172A"/>
                 <w:sz w:val="17"/>
               </w:rPr>
-              <w:t>1) Falta el SUS del equipo: se responde en la revisión humana, hasta el viernes 09/10 (UX-08). 2) Ajustes de la clase todavía junta seis secciones independientes (PAT-04). Compromiso: 1 esta semana; 2 sin cambiar lo que ve el usuario.</w:t>
+              <w:t>1) Falta el SUS del equipo: se responde en la revisión humana, hasta el viernes 09/10 (UX-08). Con él, 32/32.</w:t>
             </w:r>
           </w:p>
         </w:tc>

</xml_diff>

<commit_message>
docs(apariencia): referentes y segunda vuelta del contraste; MOB-03 con su corrección del 07/10
DISENO_APARIENCIA.md §4 bis: qué no estaba listo, cómo lo hacen Canvas, GitHub, Moodle,
YouTube y Duolingo, y lo que se tomó. La evidencia de MOB-03 en la evaluación de la IA
(2026-10-06_v2.0.0, Word y Markdown) dice ahora que la había dado por cumplida sin estarlo.

Co-Authored-By: Claude Opus 5.5 <noreply@anthropic.com>
Claude-Session: https://claude.ai/code/session_01CRFvymDoVZwBiCPLA5rBRs
</commit_message>
<xml_diff>
--- a/docs/calidad/listas-chequeo/2026-10-06_v2.0.0/CHECKLIST_INTERFAZ_2026-10-06.docx
+++ b/docs/calidad/listas-chequeo/2026-10-06_v2.0.0/CHECKLIST_INTERFAZ_2026-10-06.docx
@@ -3951,9 +3951,9 @@
               </w:rPr>
               <w:t>Pts: 2 / 2</w:t>
               <w:br/>
-              <w:t>Obs: [x] Rotación, teclados y temas probados</w:t>
+              <w:t>Obs: [x] Rotación, teclados y temas probados (corregido el 07/10)</w:t>
               <w:br/>
-              <w:t>Evidencia: Rotación sin perder el código (844×390); correo con type="email"; el código de clase pide mayúsculas y se formatea mientras se escribe («algo 2034» → «ALGO-2034»). Modo oscuro y más (desde la noche del 04/10): tema claro, oscuro o «como mi dispositivo», alto contraste, texto grande y más espacio entre líneas, en Mi perfil → «Apariencia y lectura» (docs/DISENO_APARIENCIA.md); 0 problemas de contraste de axe-core en 20 pantallas con el tema oscuro.</w:t>
+              <w:t>Evidencia: Rotación sin perder el código (844×390); correo con type="email"; el código de clase pide mayúsculas y se formatea mientras se escribe («algo 2034» → «ALGO-2034»). Apariencia: tema claro, oscuro o «como mi dispositivo», alto contraste, texto grande y más espacio entre líneas. Corrección del 07/10: Jeider la probó y vio que no estaba lista, aunque esta evaluación la había dado por cumplida. El alto contraste casi no cambiaba nada, la opción estaba escondida al final del perfil y no funcionaba con «como mi dispositivo» en oscuro. Siguiendo a Canvas, GitHub y Moodle, ahora hay un botón «Apariencia» en la cabecera con vista previa de cada tema; el alto contraste pone texto casi negro (o blanco sobre negro), bordes marcados, enlaces subrayados y foco de 3 px; se respetan «más contraste» del dispositivo y los temas de contraste de Windows. Probado con agent-browser: axe-core da 0 problemas en 19 pantallas del estudiante y el docente en los cuatro modos (docs/DISENO_APARIENCIA.md §4 bis).</w:t>
             </w:r>
           </w:p>
         </w:tc>

</xml_diff>